<commit_message>
Trim doc02 §3/§6 and doc03 §3 down to bare statements
- doc02 §3 ust. 3: cut to "Rejestr oświadczeń prowadzi osoba lub organ
  wskazany w uchwale [●]." - the PM suggestion/rationale stays only in
  projekty/README.md's open-questions table, not inline.
- doc02 §6 ust. 1: dropped the RN/Zarząd incompatibility reminder
  sentence, keeping just the disclosure/recusal rule itself.
- doc03 §3 ust. 1a: dropped the "wymóg ustawowy (...)" aside from the
  oral-report-on-request sentence.

Co-Authored-By: Claude Sonnet 5 <noreply@anthropic.com>
</commit_message>
<xml_diff>
--- a/projekty/02_Polityka_konfliktu_interesow.docx
+++ b/projekty/02_Polityka_konfliktu_interesow.docx
@@ -97,16 +97,7 @@
     </w:p>
     <w:p>
       <w:r>
-        <w:t xml:space="preserve">3. Rejestr oświadczeń prowadzi osoba lub organ wskazany w uchwale [●] — naturalnym kandydatem jest stanowisko </w:t>
-      </w:r>
-      <w:r>
-        <w:rPr>
-          <w:b/>
-        </w:rPr>
-        <w:t>PM</w:t>
-      </w:r>
-      <w:r>
-        <w:t xml:space="preserve"> (ds. organizacyjno-samorządowych), które już prowadzi rejestr członków i uchwał organów (patrz opis stanowiska PM w regulaminie organizacyjnym Spółdzielni) — do potwierdzenia uchwałą, nie zakładania z góry. Dostęp do niego ogranicza się do osób uprawnionych.</w:t>
+        <w:t>3. Rejestr oświadczeń prowadzi osoba lub organ wskazany w uchwale [●].</w:t>
       </w:r>
     </w:p>
     <w:p>
@@ -193,16 +184,7 @@
     </w:p>
     <w:p>
       <w:r>
-        <w:t xml:space="preserve">1. Członek Rady zamierzający ubiegać się o zatrudnienie w Spółdzielni lub funkcję w Zarządzie ujawnia zamiar i wyłącza się z prac dotyczących tego stanowiska. </w:t>
-      </w:r>
-      <w:r>
-        <w:rPr>
-          <w:b/>
-        </w:rPr>
-        <w:t>Przypomnienie o istniejącym już zakazie łączenia funkcji</w:t>
-      </w:r>
-      <w:r>
-        <w:t>: nie można być jednocześnie członkiem Rady Nadzorczej i Zarządu (Statut § 61) — członek Rady wybrany do Zarządu musi zrzec się mandatu w Radzie, nie może pełnić obu funkcji równolegle nawet przejściowo.</w:t>
+        <w:t>1. Członek Rady zamierzający ubiegać się o zatrudnienie w Spółdzielni lub funkcję w Zarządzie ujawnia zamiar i wyłącza się z prac dotyczących tego stanowiska.</w:t>
       </w:r>
     </w:p>
     <w:p>

</xml_diff>